<commit_message>
Report: deviation effects (manual 14.3), sanity-check note (12), SFT optimizer guide value
Co-Authored-By: Claude Opus 5.5 <noreply@anthropic.com>
</commit_message>
<xml_diff>
--- a/report/PA2_report.docx
+++ b/report/PA2_report.docx
@@ -3081,6 +3081,28 @@
         <w:t xml:space="preserve">Each comparison uses identical settings for both models. The repetition rule was fixed before any comparison was generated (§3).</w:t>
       </w:r>
     </w:p>
+    <w:p>
+      <w:pPr>
+        <w:numPr>
+          <w:ilvl w:val="0"/>
+          <w:numId w:val="1002"/>
+        </w:numPr>
+        <w:pStyle w:val="Compact"/>
+      </w:pPr>
+      <w:r>
+        <w:rPr>
+          <w:bCs/>
+          <w:b/>
+        </w:rPr>
+        <w:t xml:space="preserve">Sanity check (§12):</w:t>
+      </w:r>
+      <w:r>
+        <w:t xml:space="preserve"> </w:t>
+      </w:r>
+      <w:r>
+        <w:t xml:space="preserve">before each full generation run, 2–5 prompts per model were generated and inspected for checkpoint path, tokenizer, template, EOS behaviour and length (printed in the pipeline notebook).</w:t>
+      </w:r>
+    </w:p>
     <w:bookmarkEnd w:id="22"/>
     <w:bookmarkStart w:id="23" w:name="parameter-choices-and-deviations"/>
     <w:p>
@@ -3297,7 +3319,7 @@
               <w:jc w:val="left"/>
             </w:pPr>
             <w:r>
-              <w:t xml:space="preserve">AdamW</w:t>
+              <w:t xml:space="preserve">not specified</w:t>
             </w:r>
           </w:p>
         </w:tc>
@@ -3541,7 +3563,13 @@
           <w:bCs/>
           <w:b/>
         </w:rPr>
-        <w:t xml:space="preserve">Performance-driven choices.</w:t>
+        <w:t xml:space="preserve">Effect of the resource-driven changes.</w:t>
+      </w:r>
+      <w:r>
+        <w:t xml:space="preserve"> </w:t>
+      </w:r>
+      <w:r>
+        <w:t xml:space="preserve">We expect none of them to materially affect results, though we couldn’t measure that directly, because the unchanged setups don’t fit in 8 GB:</w:t>
       </w:r>
     </w:p>
     <w:p>
@@ -3553,134 +3581,7 @@
         <w:pStyle w:val="Compact"/>
       </w:pPr>
       <w:r>
-        <w:rPr>
-          <w:bCs/>
-          <w:b/>
-        </w:rPr>
-        <w:t xml:space="preserve">Persona LoRA configuration and selection.</w:t>
-      </w:r>
-      <w:r>
-        <w:t xml:space="preserve"> </w:t>
-      </w:r>
-      <w:r>
-        <w:t xml:space="preserve">Table 4 shows the sweep. With 20 validation pairs, reward accuracy saturates at 1.0 for every run, so it cannot select anything. Validation DPO loss keeps falling as the learning rate rises, and the lowest-loss adapters (LR ≥ 2e-4) produce looping, abusive text, a clear case of over-optimization. So each adapter generates for the 20</w:t>
-      </w:r>
-      <w:r>
-        <w:t xml:space="preserve"> </w:t>
-      </w:r>
-      <w:r>
-        <w:rPr>
-          <w:iCs/>
-          <w:i/>
-        </w:rPr>
-        <w:t xml:space="preserve">validation</w:t>
-      </w:r>
-      <w:r>
-        <w:t xml:space="preserve"> </w:t>
-      </w:r>
-      <w:r>
-        <w:t xml:space="preserve">prompts, and we pick the</w:t>
-      </w:r>
-      <w:r>
-        <w:t xml:space="preserve"> </w:t>
-      </w:r>
-      <w:r>
-        <w:rPr>
-          <w:bCs/>
-          <w:b/>
-        </w:rPr>
-        <w:t xml:space="preserve">largest validation margin among adapters with at most 5% degenerate generations</w:t>
-      </w:r>
-      <w:r>
-        <w:t xml:space="preserve"> </w:t>
-      </w:r>
-      <w:r>
-        <w:t xml:space="preserve">(degenerate = hits the token limit with fewer than 50% distinct 4-grams). This selects r = 16, LR 1e-4 (its checkpoint at step 60 has the lowest validation loss within the run). Justification for the remaining settings:</w:t>
-      </w:r>
-    </w:p>
-    <w:p>
-      <w:pPr>
-        <w:numPr>
-          <w:ilvl w:val="1"/>
-          <w:numId w:val="1004"/>
-        </w:numPr>
-        <w:pStyle w:val="Compact"/>
-      </w:pPr>
-      <w:r>
-        <w:rPr>
-          <w:bCs/>
-          <w:b/>
-        </w:rPr>
-        <w:t xml:space="preserve">Rank 16 with α = 2r:</w:t>
-      </w:r>
-      <w:r>
-        <w:t xml:space="preserve"> </w:t>
-      </w:r>
-      <w:r>
-        <w:t xml:space="preserve">rank 8 already degenerates at 2e-4, and rank 32 doubles the parameters without a quality benefit.</w:t>
-      </w:r>
-    </w:p>
-    <w:p>
-      <w:pPr>
-        <w:numPr>
-          <w:ilvl w:val="1"/>
-          <w:numId w:val="1004"/>
-        </w:numPr>
-        <w:pStyle w:val="Compact"/>
-      </w:pPr>
-      <w:r>
-        <w:rPr>
-          <w:bCs/>
-          <w:b/>
-        </w:rPr>
-        <w:t xml:space="preserve">All attention and MLP projections:</w:t>
-      </w:r>
-      <w:r>
-        <w:t xml:space="preserve"> </w:t>
-      </w:r>
-      <w:r>
-        <w:t xml:space="preserve">style spans both.</w:t>
-      </w:r>
-    </w:p>
-    <w:p>
-      <w:pPr>
-        <w:numPr>
-          <w:ilvl w:val="1"/>
-          <w:numId w:val="1004"/>
-        </w:numPr>
-        <w:pStyle w:val="Compact"/>
-      </w:pPr>
-      <w:r>
-        <w:rPr>
-          <w:bCs/>
-          <w:b/>
-        </w:rPr>
-        <w:t xml:space="preserve">Batch 16 and 5 epochs</w:t>
-      </w:r>
-      <w:r>
-        <w:t xml:space="preserve"> </w:t>
-      </w:r>
-      <w:r>
-        <w:t xml:space="preserve">(65 steps): validation loss plateaus by about step 50.</w:t>
-      </w:r>
-    </w:p>
-    <w:p>
-      <w:pPr>
-        <w:numPr>
-          <w:ilvl w:val="1"/>
-          <w:numId w:val="1004"/>
-        </w:numPr>
-        <w:pStyle w:val="Compact"/>
-      </w:pPr>
-      <w:r>
-        <w:rPr>
-          <w:bCs/>
-          <w:b/>
-        </w:rPr>
-        <w:t xml:space="preserve">β = 0.1</w:t>
-      </w:r>
-      <w:r>
-        <w:t xml:space="preserve">, matching the from-scratch runs.</w:t>
+        <w:t xml:space="preserve">The pre-computed reference, gradient checkpointing and chunked LM head are exact; they compute the same quantities.</w:t>
       </w:r>
     </w:p>
     <w:p>
@@ -3692,17 +3593,7 @@
         <w:pStyle w:val="Compact"/>
       </w:pPr>
       <w:r>
-        <w:rPr>
-          <w:bCs/>
-          <w:b/>
-        </w:rPr>
-        <w:t xml:space="preserve">SmolLM2 repetition penalty 1.1.</w:t>
-      </w:r>
-      <w:r>
-        <w:t xml:space="preserve"> </w:t>
-      </w:r>
-      <w:r>
-        <w:t xml:space="preserve">By the pre-registered rule (switch on a penalty if more than 15% of probe outputs loop), base SmolLM2 looped on 25% of probe prompts, so the persona pair uses 1.1. The Qwen SFT model looped on 4%, so Qwen keeps 1.0.</w:t>
+        <w:t xml:space="preserve">The micro-batch change keeps the effective batch at 32.</w:t>
       </w:r>
     </w:p>
     <w:p>
@@ -3710,6 +3601,223 @@
         <w:numPr>
           <w:ilvl w:val="0"/>
           <w:numId w:val="1003"/>
+        </w:numPr>
+        <w:pStyle w:val="Compact"/>
+      </w:pPr>
+      <w:r>
+        <w:t xml:space="preserve">8-bit AdamW is reported to match 32-bit Adam [8]. Our SFT and DPO curves are smooth, and DPO reaches the expected reward-accuracy range (Fig. 2).</w:t>
+      </w:r>
+    </w:p>
+    <w:p>
+      <w:pPr>
+        <w:pStyle w:val="FirstParagraph"/>
+      </w:pPr>
+      <w:r>
+        <w:rPr>
+          <w:bCs/>
+          <w:b/>
+        </w:rPr>
+        <w:t xml:space="preserve">Performance-driven choices.</w:t>
+      </w:r>
+    </w:p>
+    <w:p>
+      <w:pPr>
+        <w:numPr>
+          <w:ilvl w:val="0"/>
+          <w:numId w:val="1004"/>
+        </w:numPr>
+        <w:pStyle w:val="Compact"/>
+      </w:pPr>
+      <w:r>
+        <w:rPr>
+          <w:bCs/>
+          <w:b/>
+        </w:rPr>
+        <w:t xml:space="preserve">Persona LoRA configuration and selection.</w:t>
+      </w:r>
+      <w:r>
+        <w:t xml:space="preserve"> </w:t>
+      </w:r>
+      <w:r>
+        <w:t xml:space="preserve">Table 4 shows the sweep. With 20 validation pairs, reward accuracy saturates at 1.0 for every run, so it cannot select anything. Validation DPO loss keeps falling as the learning rate rises, and the lowest-loss adapters (LR ≥ 2e-4) produce looping, abusive text, a clear case of over-optimization. So each adapter generates for the 20</w:t>
+      </w:r>
+      <w:r>
+        <w:t xml:space="preserve"> </w:t>
+      </w:r>
+      <w:r>
+        <w:rPr>
+          <w:iCs/>
+          <w:i/>
+        </w:rPr>
+        <w:t xml:space="preserve">validation</w:t>
+      </w:r>
+      <w:r>
+        <w:t xml:space="preserve"> </w:t>
+      </w:r>
+      <w:r>
+        <w:t xml:space="preserve">prompts, and we pick the</w:t>
+      </w:r>
+      <w:r>
+        <w:t xml:space="preserve"> </w:t>
+      </w:r>
+      <w:r>
+        <w:rPr>
+          <w:bCs/>
+          <w:b/>
+        </w:rPr>
+        <w:t xml:space="preserve">largest validation margin among adapters with at most 5% degenerate generations</w:t>
+      </w:r>
+      <w:r>
+        <w:t xml:space="preserve"> </w:t>
+      </w:r>
+      <w:r>
+        <w:t xml:space="preserve">(degenerate = hits the token limit with fewer than 50% distinct 4-grams). This selects r = 16, LR 1e-4 (its checkpoint at step 60 has the lowest validation loss within the run).</w:t>
+      </w:r>
+      <w:r>
+        <w:t xml:space="preserve"> </w:t>
+      </w:r>
+      <w:r>
+        <w:rPr>
+          <w:iCs/>
+          <w:i/>
+        </w:rPr>
+        <w:t xml:space="preserve">Effect:</w:t>
+      </w:r>
+      <w:r>
+        <w:t xml:space="preserve"> </w:t>
+      </w:r>
+      <w:r>
+        <w:t xml:space="preserve">0% degenerate validation outputs, against 95–100% for the lowest-loss adapters. Justification for the remaining settings:</w:t>
+      </w:r>
+    </w:p>
+    <w:p>
+      <w:pPr>
+        <w:numPr>
+          <w:ilvl w:val="1"/>
+          <w:numId w:val="1005"/>
+        </w:numPr>
+        <w:pStyle w:val="Compact"/>
+      </w:pPr>
+      <w:r>
+        <w:rPr>
+          <w:bCs/>
+          <w:b/>
+        </w:rPr>
+        <w:t xml:space="preserve">Rank 16 with α = 2r:</w:t>
+      </w:r>
+      <w:r>
+        <w:t xml:space="preserve"> </w:t>
+      </w:r>
+      <w:r>
+        <w:t xml:space="preserve">rank 8 already degenerates at 2e-4, and rank 32 doubles the parameters without a quality benefit.</w:t>
+      </w:r>
+    </w:p>
+    <w:p>
+      <w:pPr>
+        <w:numPr>
+          <w:ilvl w:val="1"/>
+          <w:numId w:val="1005"/>
+        </w:numPr>
+        <w:pStyle w:val="Compact"/>
+      </w:pPr>
+      <w:r>
+        <w:rPr>
+          <w:bCs/>
+          <w:b/>
+        </w:rPr>
+        <w:t xml:space="preserve">All attention and MLP projections:</w:t>
+      </w:r>
+      <w:r>
+        <w:t xml:space="preserve"> </w:t>
+      </w:r>
+      <w:r>
+        <w:t xml:space="preserve">style spans both.</w:t>
+      </w:r>
+    </w:p>
+    <w:p>
+      <w:pPr>
+        <w:numPr>
+          <w:ilvl w:val="1"/>
+          <w:numId w:val="1005"/>
+        </w:numPr>
+        <w:pStyle w:val="Compact"/>
+      </w:pPr>
+      <w:r>
+        <w:rPr>
+          <w:bCs/>
+          <w:b/>
+        </w:rPr>
+        <w:t xml:space="preserve">Batch 16 and 5 epochs</w:t>
+      </w:r>
+      <w:r>
+        <w:t xml:space="preserve"> </w:t>
+      </w:r>
+      <w:r>
+        <w:t xml:space="preserve">(65 steps): validation loss plateaus by about step 50.</w:t>
+      </w:r>
+    </w:p>
+    <w:p>
+      <w:pPr>
+        <w:numPr>
+          <w:ilvl w:val="1"/>
+          <w:numId w:val="1005"/>
+        </w:numPr>
+        <w:pStyle w:val="Compact"/>
+      </w:pPr>
+      <w:r>
+        <w:rPr>
+          <w:bCs/>
+          <w:b/>
+        </w:rPr>
+        <w:t xml:space="preserve">β = 0.1</w:t>
+      </w:r>
+      <w:r>
+        <w:t xml:space="preserve">, matching the from-scratch runs.</w:t>
+      </w:r>
+    </w:p>
+    <w:p>
+      <w:pPr>
+        <w:numPr>
+          <w:ilvl w:val="0"/>
+          <w:numId w:val="1004"/>
+        </w:numPr>
+        <w:pStyle w:val="Compact"/>
+      </w:pPr>
+      <w:r>
+        <w:rPr>
+          <w:bCs/>
+          <w:b/>
+        </w:rPr>
+        <w:t xml:space="preserve">SmolLM2 repetition penalty 1.1.</w:t>
+      </w:r>
+      <w:r>
+        <w:t xml:space="preserve"> </w:t>
+      </w:r>
+      <w:r>
+        <w:t xml:space="preserve">By the pre-registered rule (switch on a penalty if more than 15% of probe outputs loop), base SmolLM2 looped on 25% of probe prompts, so the persona pair uses 1.1. The Qwen SFT model looped on 4%, so Qwen keeps 1.0.</w:t>
+      </w:r>
+      <w:r>
+        <w:t xml:space="preserve"> </w:t>
+      </w:r>
+      <w:r>
+        <w:rPr>
+          <w:iCs/>
+          <w:i/>
+        </w:rPr>
+        <w:t xml:space="preserve">Effect:</w:t>
+      </w:r>
+      <w:r>
+        <w:t xml:space="preserve"> </w:t>
+      </w:r>
+      <w:r>
+        <w:t xml:space="preserve">with 1.1, base SmolLM2 reaches the token limit on only 1 of its 40 persona-eval outputs, and the setting is identical for both persona models.</w:t>
+      </w:r>
+    </w:p>
+    <w:p>
+      <w:pPr>
+        <w:numPr>
+          <w:ilvl w:val="0"/>
+          <w:numId w:val="1004"/>
         </w:numPr>
         <w:pStyle w:val="Compact"/>
       </w:pPr>
@@ -4500,7 +4608,7 @@
       <w:pPr>
         <w:numPr>
           <w:ilvl w:val="0"/>
-          <w:numId w:val="1005"/>
+          <w:numId w:val="1006"/>
         </w:numPr>
         <w:pStyle w:val="Compact"/>
       </w:pPr>
@@ -4534,7 +4642,7 @@
       <w:pPr>
         <w:numPr>
           <w:ilvl w:val="0"/>
-          <w:numId w:val="1005"/>
+          <w:numId w:val="1006"/>
         </w:numPr>
         <w:pStyle w:val="Compact"/>
       </w:pPr>
@@ -4680,7 +4788,7 @@
       <w:pPr>
         <w:numPr>
           <w:ilvl w:val="0"/>
-          <w:numId w:val="1006"/>
+          <w:numId w:val="1007"/>
         </w:numPr>
         <w:pStyle w:val="Compact"/>
       </w:pPr>
@@ -4702,7 +4810,7 @@
       <w:pPr>
         <w:numPr>
           <w:ilvl w:val="0"/>
-          <w:numId w:val="1006"/>
+          <w:numId w:val="1007"/>
         </w:numPr>
         <w:pStyle w:val="Compact"/>
       </w:pPr>
@@ -4724,7 +4832,7 @@
       <w:pPr>
         <w:numPr>
           <w:ilvl w:val="0"/>
-          <w:numId w:val="1006"/>
+          <w:numId w:val="1007"/>
         </w:numPr>
         <w:pStyle w:val="Compact"/>
       </w:pPr>
@@ -4746,7 +4854,7 @@
       <w:pPr>
         <w:numPr>
           <w:ilvl w:val="0"/>
-          <w:numId w:val="1006"/>
+          <w:numId w:val="1007"/>
         </w:numPr>
         <w:pStyle w:val="Compact"/>
       </w:pPr>
@@ -4786,7 +4894,7 @@
       <w:pPr>
         <w:numPr>
           <w:ilvl w:val="0"/>
-          <w:numId w:val="1006"/>
+          <w:numId w:val="1007"/>
         </w:numPr>
         <w:pStyle w:val="Compact"/>
       </w:pPr>
@@ -4808,7 +4916,7 @@
       <w:pPr>
         <w:numPr>
           <w:ilvl w:val="0"/>
-          <w:numId w:val="1006"/>
+          <w:numId w:val="1007"/>
         </w:numPr>
         <w:pStyle w:val="Compact"/>
       </w:pPr>
@@ -5000,163 +5108,68 @@
       <w:pPr>
         <w:numPr>
           <w:ilvl w:val="0"/>
-          <w:numId w:val="1007"/>
-        </w:numPr>
-        <w:pStyle w:val="Compact"/>
-      </w:pPr>
-      <w:r>
-        <w:rPr>
-          <w:bCs/>
-          <w:b/>
-        </w:rPr>
-        <w:t xml:space="preserve">Judge and access:</w:t>
-      </w:r>
-      <w:r>
-        <w:t xml:space="preserve"> </w:t>
-      </w:r>
-      <w:r>
-        <w:rPr>
-          <w:rStyle w:val="VerbatimChar"/>
-        </w:rPr>
-        <w:t xml:space="preserve">google/gemini-3.6-flash</w:t>
-      </w:r>
-      <w:r>
-        <w:t xml:space="preserve"> </w:t>
-      </w:r>
-      <w:r>
-        <w:t xml:space="preserve">through</w:t>
-      </w:r>
-      <w:r>
-        <w:t xml:space="preserve"> </w:t>
-      </w:r>
-      <w:r>
-        <w:rPr>
-          <w:rStyle w:val="VerbatimChar"/>
-        </w:rPr>
-        <w:t xml:space="preserve">kaggle_benchmarks</w:t>
-      </w:r>
-      <w:r>
-        <w:t xml:space="preserve"> </w:t>
-      </w:r>
-      <w:r>
-        <w:t xml:space="preserve">in a Kaggle Benchmarks task notebook, temperature 0.</w:t>
-      </w:r>
-    </w:p>
-    <w:p>
-      <w:pPr>
-        <w:numPr>
-          <w:ilvl w:val="0"/>
-          <w:numId w:val="1007"/>
-        </w:numPr>
-        <w:pStyle w:val="Compact"/>
-      </w:pPr>
-      <w:r>
-        <w:rPr>
-          <w:bCs/>
-          <w:b/>
-        </w:rPr>
-        <w:t xml:space="preserve">Blinding:</w:t>
-      </w:r>
-      <w:r>
-        <w:t xml:space="preserve"> </w:t>
-      </w:r>
-      <w:r>
-        <w:t xml:space="preserve">for each prompt the two responses are shown in an order randomized with seed 42, labeled only</w:t>
-      </w:r>
-      <w:r>
-        <w:t xml:space="preserve"> </w:t>
-      </w:r>
-      <w:r>
-        <w:t xml:space="preserve">“</w:t>
-      </w:r>
-      <w:r>
-        <w:t xml:space="preserve">Response A</w:t>
-      </w:r>
-      <w:r>
-        <w:t xml:space="preserve">”</w:t>
-      </w:r>
-      <w:r>
-        <w:t xml:space="preserve"> </w:t>
-      </w:r>
-      <w:r>
-        <w:t xml:space="preserve">and</w:t>
-      </w:r>
-      <w:r>
-        <w:t xml:space="preserve"> </w:t>
-      </w:r>
-      <w:r>
-        <w:t xml:space="preserve">“</w:t>
-      </w:r>
-      <w:r>
-        <w:t xml:space="preserve">Response B</w:t>
-      </w:r>
-      <w:r>
-        <w:t xml:space="preserve">”</w:t>
-      </w:r>
-      <w:r>
-        <w:t xml:space="preserve">. The model mapping stays in hidden metadata and is applied only after judging.</w:t>
-      </w:r>
-    </w:p>
-    <w:p>
-      <w:pPr>
-        <w:numPr>
-          <w:ilvl w:val="0"/>
-          <w:numId w:val="1007"/>
-        </w:numPr>
-        <w:pStyle w:val="Compact"/>
-      </w:pPr>
-      <w:r>
-        <w:rPr>
-          <w:bCs/>
-          <w:b/>
-        </w:rPr>
-        <w:t xml:space="preserve">Batching and reliability:</w:t>
-      </w:r>
-      <w:r>
-        <w:t xml:space="preserve"> </w:t>
-      </w:r>
-      <w:r>
-        <w:t xml:space="preserve">5 pairs per request; ≥ 5 s sleep before every attempt; up to 3 attempts per batch; judgments checkpointed after every batch; failures logged to JSONL; resumable.</w:t>
-      </w:r>
-    </w:p>
-    <w:p>
-      <w:pPr>
-        <w:numPr>
-          <w:ilvl w:val="0"/>
-          <w:numId w:val="1007"/>
-        </w:numPr>
-        <w:pStyle w:val="Compact"/>
-      </w:pPr>
-      <w:r>
-        <w:rPr>
-          <w:bCs/>
-          <w:b/>
-        </w:rPr>
-        <w:t xml:space="preserve">Rubrics:</w:t>
-      </w:r>
-    </w:p>
-    <w:p>
-      <w:pPr>
-        <w:numPr>
-          <w:ilvl w:val="1"/>
           <w:numId w:val="1008"/>
         </w:numPr>
         <w:pStyle w:val="Compact"/>
       </w:pPr>
       <w:r>
-        <w:t xml:space="preserve">general (AlpacaEval): helpfulness, correctness, instruction following, concision, formatting, no hallucination or unsafe content;</w:t>
+        <w:rPr>
+          <w:bCs/>
+          <w:b/>
+        </w:rPr>
+        <w:t xml:space="preserve">Judge and access:</w:t>
+      </w:r>
+      <w:r>
+        <w:t xml:space="preserve"> </w:t>
+      </w:r>
+      <w:r>
+        <w:rPr>
+          <w:rStyle w:val="VerbatimChar"/>
+        </w:rPr>
+        <w:t xml:space="preserve">google/gemini-3.6-flash</w:t>
+      </w:r>
+      <w:r>
+        <w:t xml:space="preserve"> </w:t>
+      </w:r>
+      <w:r>
+        <w:t xml:space="preserve">through</w:t>
+      </w:r>
+      <w:r>
+        <w:t xml:space="preserve"> </w:t>
+      </w:r>
+      <w:r>
+        <w:rPr>
+          <w:rStyle w:val="VerbatimChar"/>
+        </w:rPr>
+        <w:t xml:space="preserve">kaggle_benchmarks</w:t>
+      </w:r>
+      <w:r>
+        <w:t xml:space="preserve"> </w:t>
+      </w:r>
+      <w:r>
+        <w:t xml:space="preserve">in a Kaggle Benchmarks task notebook, temperature 0.</w:t>
       </w:r>
     </w:p>
     <w:p>
       <w:pPr>
         <w:numPr>
-          <w:ilvl w:val="1"/>
+          <w:ilvl w:val="0"/>
           <w:numId w:val="1008"/>
         </w:numPr>
         <w:pStyle w:val="Compact"/>
       </w:pPr>
       <w:r>
-        <w:t xml:space="preserve">safety-aware (HH): additionally rewards appropriate refusal, privacy protection, calibrated uncertainty and safe redirection, and penalizes over-refusal; each HH item also includes the eval set’s own</w:t>
+        <w:rPr>
+          <w:bCs/>
+          <w:b/>
+        </w:rPr>
+        <w:t xml:space="preserve">Blinding:</w:t>
+      </w:r>
+      <w:r>
+        <w:t xml:space="preserve"> </w:t>
+      </w:r>
+      <w:r>
+        <w:t xml:space="preserve">for each prompt the two responses are shown in an order randomized with seed 42, labeled only</w:t>
       </w:r>
       <w:r>
         <w:t xml:space="preserve"> </w:t>
@@ -5165,7 +5178,7 @@
         <w:t xml:space="preserve">“</w:t>
       </w:r>
       <w:r>
-        <w:t xml:space="preserve">expected behavior</w:t>
+        <w:t xml:space="preserve">Response A</w:t>
       </w:r>
       <w:r>
         <w:t xml:space="preserve">”</w:t>
@@ -5174,18 +5187,113 @@
         <w:t xml:space="preserve"> </w:t>
       </w:r>
       <w:r>
-        <w:t xml:space="preserve">note;</w:t>
+        <w:t xml:space="preserve">and</w:t>
+      </w:r>
+      <w:r>
+        <w:t xml:space="preserve"> </w:t>
+      </w:r>
+      <w:r>
+        <w:t xml:space="preserve">“</w:t>
+      </w:r>
+      <w:r>
+        <w:t xml:space="preserve">Response B</w:t>
+      </w:r>
+      <w:r>
+        <w:t xml:space="preserve">”</w:t>
+      </w:r>
+      <w:r>
+        <w:t xml:space="preserve">. The model mapping stays in hidden metadata and is applied only after judging.</w:t>
       </w:r>
     </w:p>
     <w:p>
       <w:pPr>
         <w:numPr>
-          <w:ilvl w:val="1"/>
+          <w:ilvl w:val="0"/>
           <w:numId w:val="1008"/>
         </w:numPr>
         <w:pStyle w:val="Compact"/>
       </w:pPr>
       <w:r>
+        <w:rPr>
+          <w:bCs/>
+          <w:b/>
+        </w:rPr>
+        <w:t xml:space="preserve">Batching and reliability:</w:t>
+      </w:r>
+      <w:r>
+        <w:t xml:space="preserve"> </w:t>
+      </w:r>
+      <w:r>
+        <w:t xml:space="preserve">5 pairs per request; ≥ 5 s sleep before every attempt; up to 3 attempts per batch; judgments checkpointed after every batch; failures logged to JSONL; resumable.</w:t>
+      </w:r>
+    </w:p>
+    <w:p>
+      <w:pPr>
+        <w:numPr>
+          <w:ilvl w:val="0"/>
+          <w:numId w:val="1008"/>
+        </w:numPr>
+        <w:pStyle w:val="Compact"/>
+      </w:pPr>
+      <w:r>
+        <w:rPr>
+          <w:bCs/>
+          <w:b/>
+        </w:rPr>
+        <w:t xml:space="preserve">Rubrics:</w:t>
+      </w:r>
+    </w:p>
+    <w:p>
+      <w:pPr>
+        <w:numPr>
+          <w:ilvl w:val="1"/>
+          <w:numId w:val="1009"/>
+        </w:numPr>
+        <w:pStyle w:val="Compact"/>
+      </w:pPr>
+      <w:r>
+        <w:t xml:space="preserve">general (AlpacaEval): helpfulness, correctness, instruction following, concision, formatting, no hallucination or unsafe content;</w:t>
+      </w:r>
+    </w:p>
+    <w:p>
+      <w:pPr>
+        <w:numPr>
+          <w:ilvl w:val="1"/>
+          <w:numId w:val="1009"/>
+        </w:numPr>
+        <w:pStyle w:val="Compact"/>
+      </w:pPr>
+      <w:r>
+        <w:t xml:space="preserve">safety-aware (HH): additionally rewards appropriate refusal, privacy protection, calibrated uncertainty and safe redirection, and penalizes over-refusal; each HH item also includes the eval set’s own</w:t>
+      </w:r>
+      <w:r>
+        <w:t xml:space="preserve"> </w:t>
+      </w:r>
+      <w:r>
+        <w:t xml:space="preserve">“</w:t>
+      </w:r>
+      <w:r>
+        <w:t xml:space="preserve">expected behavior</w:t>
+      </w:r>
+      <w:r>
+        <w:t xml:space="preserve">”</w:t>
+      </w:r>
+      <w:r>
+        <w:t xml:space="preserve"> </w:t>
+      </w:r>
+      <w:r>
+        <w:t xml:space="preserve">note;</w:t>
+      </w:r>
+    </w:p>
+    <w:p>
+      <w:pPr>
+        <w:numPr>
+          <w:ilvl w:val="1"/>
+          <w:numId w:val="1009"/>
+        </w:numPr>
+        <w:pStyle w:val="Compact"/>
+      </w:pPr>
+      <w:r>
         <w:t xml:space="preserve">persona: two separate verdicts,</w:t>
       </w:r>
       <w:r>
@@ -5222,7 +5330,7 @@
       <w:pPr>
         <w:numPr>
           <w:ilvl w:val="0"/>
-          <w:numId w:val="1007"/>
+          <w:numId w:val="1008"/>
         </w:numPr>
         <w:pStyle w:val="Compact"/>
       </w:pPr>
@@ -5260,7 +5368,7 @@
       <w:pPr>
         <w:numPr>
           <w:ilvl w:val="0"/>
-          <w:numId w:val="1007"/>
+          <w:numId w:val="1008"/>
         </w:numPr>
         <w:pStyle w:val="Compact"/>
       </w:pPr>
@@ -5893,7 +6001,7 @@
       <w:pPr>
         <w:numPr>
           <w:ilvl w:val="0"/>
-          <w:numId w:val="1009"/>
+          <w:numId w:val="1010"/>
         </w:numPr>
         <w:pStyle w:val="Compact"/>
       </w:pPr>
@@ -5909,72 +6017,6 @@
       </w:r>
       <w:r>
         <w:t xml:space="preserve">the adapter wins 18, ties 21, loses 1. Win rate 0.95 [0.75, 0.99] excluding ties; 0.71 with ties as ½.</w:t>
-      </w:r>
-    </w:p>
-    <w:p>
-      <w:pPr>
-        <w:numPr>
-          <w:ilvl w:val="0"/>
-          <w:numId w:val="1009"/>
-        </w:numPr>
-        <w:pStyle w:val="Compact"/>
-      </w:pPr>
-      <w:r>
-        <w:rPr>
-          <w:bCs/>
-          <w:b/>
-        </w:rPr>
-        <w:t xml:space="preserve">Quality</w:t>
-      </w:r>
-      <w:r>
-        <w:t xml:space="preserve"> </w:t>
-      </w:r>
-      <w:r>
-        <w:t xml:space="preserve">(helpfulness, correctness and safety, ignoring style): it wins 14, ties 4, loses 22. Win rate 0.39 [0.25, 0.55] excluding ties; 0.40 with ties as ½.</w:t>
-      </w:r>
-    </w:p>
-    <w:p>
-      <w:pPr>
-        <w:numPr>
-          <w:ilvl w:val="0"/>
-          <w:numId w:val="1009"/>
-        </w:numPr>
-        <w:pStyle w:val="Compact"/>
-      </w:pPr>
-      <w:r>
-        <w:rPr>
-          <w:bCs/>
-          <w:b/>
-        </w:rPr>
-        <w:t xml:space="preserve">Where quality is lost:</w:t>
-      </w:r>
-      <w:r>
-        <w:t xml:space="preserve"> </w:t>
-      </w:r>
-      <w:r>
-        <w:t xml:space="preserve">cooking (3–7), coding (3–5) and general help (3–6). Safety-sensitive prompts are about even (5–4).</w:t>
-      </w:r>
-    </w:p>
-    <w:bookmarkEnd w:id="37"/>
-    <w:bookmarkStart w:id="38" w:name="interpretation-and-error-analysis"/>
-    <w:p>
-      <w:pPr>
-        <w:pStyle w:val="Heading1"/>
-      </w:pPr>
-      <w:r>
-        <w:t xml:space="preserve">6 Interpretation and error analysis</w:t>
-      </w:r>
-    </w:p>
-    <w:p>
-      <w:pPr>
-        <w:pStyle w:val="FirstParagraph"/>
-      </w:pPr>
-      <w:r>
-        <w:rPr>
-          <w:bCs/>
-          <w:b/>
-        </w:rPr>
-        <w:t xml:space="preserve">HH-RLHF DPO is better than SFT by a wide margin (190–75), and the gain sits where HH-RLHF teaches refusal.</w:t>
       </w:r>
     </w:p>
     <w:p>
@@ -5987,58 +6029,16 @@
       </w:pPr>
       <w:r>
         <w:rPr>
-          <w:iCs/>
-          <w:i/>
-        </w:rPr>
-        <w:t xml:space="preserve">Observed:</w:t>
-      </w:r>
-    </w:p>
-    <w:p>
-      <w:pPr>
-        <w:numPr>
-          <w:ilvl w:val="1"/>
-          <w:numId w:val="1011"/>
-        </w:numPr>
-        <w:pStyle w:val="Compact"/>
-      </w:pPr>
-      <w:r>
-        <w:t xml:space="preserve">Win rates by category: harmful instructions 0.96, privacy and doxxing 0.91, cyber abuse 0.88, legal and financial 0.83, self-harm support 0.70 (Fig. 4b).</w:t>
-      </w:r>
-    </w:p>
-    <w:p>
-      <w:pPr>
-        <w:numPr>
-          <w:ilvl w:val="1"/>
-          <w:numId w:val="1011"/>
-        </w:numPr>
-        <w:pStyle w:val="Compact"/>
-      </w:pPr>
-      <w:r>
-        <w:t xml:space="preserve">Benign helpfulness 0.68, so the model is not over-refusing.</w:t>
-      </w:r>
-    </w:p>
-    <w:p>
-      <w:pPr>
-        <w:numPr>
-          <w:ilvl w:val="1"/>
-          <w:numId w:val="1011"/>
-        </w:numPr>
-        <w:pStyle w:val="Compact"/>
-      </w:pPr>
-      <w:r>
-        <w:t xml:space="preserve">The only losing category is calibration and uncertainty (0.42).</w:t>
-      </w:r>
-    </w:p>
-    <w:p>
-      <w:pPr>
-        <w:numPr>
-          <w:ilvl w:val="1"/>
-          <w:numId w:val="1011"/>
-        </w:numPr>
-        <w:pStyle w:val="Compact"/>
-      </w:pPr>
-      <w:r>
-        <w:t xml:space="preserve">Answers get shorter (183 → 160 tokens). When DPO’s answer is the shorter one it wins 109–21; when it’s longer, 41–37.</w:t>
+          <w:bCs/>
+          <w:b/>
+        </w:rPr>
+        <w:t xml:space="preserve">Quality</w:t>
+      </w:r>
+      <w:r>
+        <w:t xml:space="preserve"> </w:t>
+      </w:r>
+      <w:r>
+        <w:t xml:space="preserve">(helpfulness, correctness and safety, ignoring style): it wins 14, ties 4, loses 22. Win rate 0.39 [0.25, 0.55] excluding ties; 0.40 with ties as ½.</w:t>
       </w:r>
     </w:p>
     <w:p>
@@ -6051,10 +6051,54 @@
       </w:pPr>
       <w:r>
         <w:rPr>
+          <w:bCs/>
+          <w:b/>
+        </w:rPr>
+        <w:t xml:space="preserve">Where quality is lost:</w:t>
+      </w:r>
+      <w:r>
+        <w:t xml:space="preserve"> </w:t>
+      </w:r>
+      <w:r>
+        <w:t xml:space="preserve">cooking (3–7), coding (3–5) and general help (3–6). Safety-sensitive prompts are about even (5–4).</w:t>
+      </w:r>
+    </w:p>
+    <w:bookmarkEnd w:id="37"/>
+    <w:bookmarkStart w:id="38" w:name="interpretation-and-error-analysis"/>
+    <w:p>
+      <w:pPr>
+        <w:pStyle w:val="Heading1"/>
+      </w:pPr>
+      <w:r>
+        <w:t xml:space="preserve">6 Interpretation and error analysis</w:t>
+      </w:r>
+    </w:p>
+    <w:p>
+      <w:pPr>
+        <w:pStyle w:val="FirstParagraph"/>
+      </w:pPr>
+      <w:r>
+        <w:rPr>
+          <w:bCs/>
+          <w:b/>
+        </w:rPr>
+        <w:t xml:space="preserve">HH-RLHF DPO is better than SFT by a wide margin (190–75), and the gain sits where HH-RLHF teaches refusal.</w:t>
+      </w:r>
+    </w:p>
+    <w:p>
+      <w:pPr>
+        <w:numPr>
+          <w:ilvl w:val="0"/>
+          <w:numId w:val="1011"/>
+        </w:numPr>
+        <w:pStyle w:val="Compact"/>
+      </w:pPr>
+      <w:r>
+        <w:rPr>
           <w:iCs/>
           <w:i/>
         </w:rPr>
-        <w:t xml:space="preserve">Interpretation:</w:t>
+        <w:t xml:space="preserve">Observed:</w:t>
       </w:r>
     </w:p>
     <w:p>
@@ -6066,40 +6110,7 @@
         <w:pStyle w:val="Compact"/>
       </w:pPr>
       <w:r>
-        <w:t xml:space="preserve">HH-RLHF preference pairs separate</w:t>
-      </w:r>
-      <w:r>
-        <w:t xml:space="preserve"> </w:t>
-      </w:r>
-      <w:r>
-        <w:t xml:space="preserve">“</w:t>
-      </w:r>
-      <w:r>
-        <w:t xml:space="preserve">comply</w:t>
-      </w:r>
-      <w:r>
-        <w:t xml:space="preserve">”</w:t>
-      </w:r>
-      <w:r>
-        <w:t xml:space="preserve"> </w:t>
-      </w:r>
-      <w:r>
-        <w:t xml:space="preserve">from</w:t>
-      </w:r>
-      <w:r>
-        <w:t xml:space="preserve"> </w:t>
-      </w:r>
-      <w:r>
-        <w:t xml:space="preserve">“</w:t>
-      </w:r>
-      <w:r>
-        <w:t xml:space="preserve">decline or deflect</w:t>
-      </w:r>
-      <w:r>
-        <w:t xml:space="preserve">”</w:t>
-      </w:r>
-      <w:r>
-        <w:t xml:space="preserve">, and DPO learned to decline.</w:t>
+        <w:t xml:space="preserve">Win rates by category: harmful instructions 0.96, privacy and doxxing 0.91, cyber abuse 0.88, legal and financial 0.83, self-harm support 0.70 (Fig. 4b).</w:t>
       </w:r>
     </w:p>
     <w:p>
@@ -6111,7 +6122,7 @@
         <w:pStyle w:val="Compact"/>
       </w:pPr>
       <w:r>
-        <w:t xml:space="preserve">The data’s short register (about 35 words per response) also shortens answers. Chosen and rejected HH responses are almost the same length (36 vs 34 words), so this is not a learned length preference.</w:t>
+        <w:t xml:space="preserve">Benign helpfulness 0.68, so the model is not over-refusing.</w:t>
       </w:r>
     </w:p>
     <w:p>
@@ -6123,23 +6134,7 @@
         <w:pStyle w:val="Compact"/>
       </w:pPr>
       <w:r>
-        <w:t xml:space="preserve">The deflections are not principled refusals (E1, E2): the gain is largely</w:t>
-      </w:r>
-      <w:r>
-        <w:t xml:space="preserve"> </w:t>
-      </w:r>
-      <w:r>
-        <w:rPr>
-          <w:iCs/>
-          <w:i/>
-        </w:rPr>
-        <w:t xml:space="preserve">not giving</w:t>
-      </w:r>
-      <w:r>
-        <w:t xml:space="preserve"> </w:t>
-      </w:r>
-      <w:r>
-        <w:t xml:space="preserve">harmful detail.</w:t>
+        <w:t xml:space="preserve">The only losing category is calibration and uncertainty (0.42).</w:t>
       </w:r>
     </w:p>
     <w:p>
@@ -6151,157 +6146,194 @@
         <w:pStyle w:val="Compact"/>
       </w:pPr>
       <w:r>
-        <w:t xml:space="preserve">The shorter, flatter answers cost nuance where hedging matters (E3).</w:t>
+        <w:t xml:space="preserve">Answers get shorter (183 → 160 tokens). When DPO’s answer is the shorter one it wins 109–21; when it’s longer, 41–37.</w:t>
+      </w:r>
+    </w:p>
+    <w:p>
+      <w:pPr>
+        <w:numPr>
+          <w:ilvl w:val="0"/>
+          <w:numId w:val="1011"/>
+        </w:numPr>
+        <w:pStyle w:val="Compact"/>
+      </w:pPr>
+      <w:r>
+        <w:rPr>
+          <w:iCs/>
+          <w:i/>
+        </w:rPr>
+        <w:t xml:space="preserve">Interpretation:</w:t>
       </w:r>
     </w:p>
     <w:p>
       <w:pPr>
         <w:numPr>
           <w:ilvl w:val="1"/>
-          <w:numId w:val="1012"/>
-        </w:numPr>
-        <w:pStyle w:val="Compact"/>
-      </w:pPr>
-      <w:r>
-        <w:t xml:space="preserve">With β = 0.1, the final validation margin of 0.24 means the chosen-vs-rejected log-ratio moved only 2.4 nats away from the SFT reference (UltraFeedback: 6.6). That modest shift fits small behavioural changes outside the safety categories.</w:t>
-      </w:r>
-    </w:p>
-    <w:p>
-      <w:pPr>
-        <w:numPr>
-          <w:ilvl w:val="1"/>
-          <w:numId w:val="1012"/>
-        </w:numPr>
-        <w:pStyle w:val="Compact"/>
-      </w:pPr>
-      <w:r>
-        <w:t xml:space="preserve">Validation accuracy was still rising at step 469, so a longer run would plausibly widen the gap.</w:t>
-      </w:r>
-    </w:p>
-    <w:p>
-      <w:pPr>
-        <w:numPr>
-          <w:ilvl w:val="0"/>
-          <w:numId w:val="1010"/>
-        </w:numPr>
-        <w:pStyle w:val="Compact"/>
-      </w:pPr>
-      <w:r>
-        <w:rPr>
-          <w:bCs/>
-          <w:b/>
-        </w:rPr>
-        <w:t xml:space="preserve">The duplicate prompts don’t change the result.</w:t>
-      </w:r>
-      <w:r>
-        <w:t xml:space="preserve"> </w:t>
-      </w:r>
-      <w:r>
-        <w:t xml:space="preserve">The provided HH set repeats 115 of its 300 prompts. Deduplicated, the result is 0.71 [0.64, 0.78] (Table 5).</w:t>
-      </w:r>
-    </w:p>
-    <w:p>
-      <w:pPr>
-        <w:pStyle w:val="FirstParagraph"/>
-      </w:pPr>
-      <w:r>
-        <w:rPr>
-          <w:bCs/>
-          <w:b/>
-        </w:rPr>
-        <w:t xml:space="preserve">UltraFeedback DPO is not better than SFT (103–123; the CI includes 0.5).</w:t>
-      </w:r>
-    </w:p>
-    <w:p>
-      <w:pPr>
-        <w:numPr>
-          <w:ilvl w:val="0"/>
           <w:numId w:val="1013"/>
         </w:numPr>
         <w:pStyle w:val="Compact"/>
       </w:pPr>
       <w:r>
+        <w:t xml:space="preserve">HH-RLHF preference pairs separate</w:t>
+      </w:r>
+      <w:r>
+        <w:t xml:space="preserve"> </w:t>
+      </w:r>
+      <w:r>
+        <w:t xml:space="preserve">“</w:t>
+      </w:r>
+      <w:r>
+        <w:t xml:space="preserve">comply</w:t>
+      </w:r>
+      <w:r>
+        <w:t xml:space="preserve">”</w:t>
+      </w:r>
+      <w:r>
+        <w:t xml:space="preserve"> </w:t>
+      </w:r>
+      <w:r>
+        <w:t xml:space="preserve">from</w:t>
+      </w:r>
+      <w:r>
+        <w:t xml:space="preserve"> </w:t>
+      </w:r>
+      <w:r>
+        <w:t xml:space="preserve">“</w:t>
+      </w:r>
+      <w:r>
+        <w:t xml:space="preserve">decline or deflect</w:t>
+      </w:r>
+      <w:r>
+        <w:t xml:space="preserve">”</w:t>
+      </w:r>
+      <w:r>
+        <w:t xml:space="preserve">, and DPO learned to decline.</w:t>
+      </w:r>
+    </w:p>
+    <w:p>
+      <w:pPr>
+        <w:numPr>
+          <w:ilvl w:val="1"/>
+          <w:numId w:val="1013"/>
+        </w:numPr>
+        <w:pStyle w:val="Compact"/>
+      </w:pPr>
+      <w:r>
+        <w:t xml:space="preserve">The data’s short register (about 35 words per response) also shortens answers. Chosen and rejected HH responses are almost the same length (36 vs 34 words), so this is not a learned length preference.</w:t>
+      </w:r>
+    </w:p>
+    <w:p>
+      <w:pPr>
+        <w:numPr>
+          <w:ilvl w:val="1"/>
+          <w:numId w:val="1013"/>
+        </w:numPr>
+        <w:pStyle w:val="Compact"/>
+      </w:pPr>
+      <w:r>
+        <w:t xml:space="preserve">The deflections are not principled refusals (E1, E2): the gain is largely</w:t>
+      </w:r>
+      <w:r>
+        <w:t xml:space="preserve"> </w:t>
+      </w:r>
+      <w:r>
         <w:rPr>
           <w:iCs/>
           <w:i/>
         </w:rPr>
-        <w:t xml:space="preserve">Observed:</w:t>
+        <w:t xml:space="preserve">not giving</w:t>
+      </w:r>
+      <w:r>
+        <w:t xml:space="preserve"> </w:t>
+      </w:r>
+      <w:r>
+        <w:t xml:space="preserve">harmful detail.</w:t>
       </w:r>
     </w:p>
     <w:p>
       <w:pPr>
         <w:numPr>
           <w:ilvl w:val="1"/>
+          <w:numId w:val="1013"/>
+        </w:numPr>
+        <w:pStyle w:val="Compact"/>
+      </w:pPr>
+      <w:r>
+        <w:t xml:space="preserve">The shorter, flatter answers cost nuance where hedging matters (E3).</w:t>
+      </w:r>
+    </w:p>
+    <w:p>
+      <w:pPr>
+        <w:numPr>
+          <w:ilvl w:val="1"/>
+          <w:numId w:val="1013"/>
+        </w:numPr>
+        <w:pStyle w:val="Compact"/>
+      </w:pPr>
+      <w:r>
+        <w:t xml:space="preserve">With β = 0.1, the final validation margin of 0.24 means the chosen-vs-rejected log-ratio moved only 2.4 nats away from the SFT reference (UltraFeedback: 6.6). That modest shift fits small behavioural changes outside the safety categories.</w:t>
+      </w:r>
+    </w:p>
+    <w:p>
+      <w:pPr>
+        <w:numPr>
+          <w:ilvl w:val="1"/>
+          <w:numId w:val="1013"/>
+        </w:numPr>
+        <w:pStyle w:val="Compact"/>
+      </w:pPr>
+      <w:r>
+        <w:t xml:space="preserve">Validation accuracy was still rising at step 469, so a longer run would plausibly widen the gap.</w:t>
+      </w:r>
+    </w:p>
+    <w:p>
+      <w:pPr>
+        <w:numPr>
+          <w:ilvl w:val="0"/>
+          <w:numId w:val="1011"/>
+        </w:numPr>
+        <w:pStyle w:val="Compact"/>
+      </w:pPr>
+      <w:r>
+        <w:rPr>
+          <w:bCs/>
+          <w:b/>
+        </w:rPr>
+        <w:t xml:space="preserve">The duplicate prompts don’t change the result.</w:t>
+      </w:r>
+      <w:r>
+        <w:t xml:space="preserve"> </w:t>
+      </w:r>
+      <w:r>
+        <w:t xml:space="preserve">The provided HH set repeats 115 of its 300 prompts. Deduplicated, the result is 0.71 [0.64, 0.78] (Table 5).</w:t>
+      </w:r>
+    </w:p>
+    <w:p>
+      <w:pPr>
+        <w:pStyle w:val="FirstParagraph"/>
+      </w:pPr>
+      <w:r>
+        <w:rPr>
+          <w:bCs/>
+          <w:b/>
+        </w:rPr>
+        <w:t xml:space="preserve">UltraFeedback DPO is not better than SFT (103–123; the CI includes 0.5).</w:t>
+      </w:r>
+    </w:p>
+    <w:p>
+      <w:pPr>
+        <w:numPr>
+          <w:ilvl w:val="0"/>
           <w:numId w:val="1014"/>
         </w:numPr>
         <w:pStyle w:val="Compact"/>
       </w:pPr>
       <w:r>
-        <w:t xml:space="preserve">DPO answers are 37% longer (215 → 294 tokens) and hit the 512-token limit more often (15% → 20%).</w:t>
-      </w:r>
-    </w:p>
-    <w:p>
-      <w:pPr>
-        <w:numPr>
-          <w:ilvl w:val="1"/>
-          <w:numId w:val="1014"/>
-        </w:numPr>
-        <w:pStyle w:val="Compact"/>
-      </w:pPr>
-      <w:r>
-        <w:t xml:space="preserve">When DPO hits the limit, it wins 10 and loses 26. In 21 of those 26 losses, the judge’s reason names a repetition loop (E4).</w:t>
-      </w:r>
-    </w:p>
-    <w:p>
-      <w:pPr>
-        <w:numPr>
-          <w:ilvl w:val="1"/>
-          <w:numId w:val="1014"/>
-        </w:numPr>
-        <w:pStyle w:val="Compact"/>
-      </w:pPr>
-      <w:r>
-        <w:t xml:space="preserve">When it doesn’t hit the limit, the comparison is even (93–97).</w:t>
-      </w:r>
-    </w:p>
-    <w:p>
-      <w:pPr>
-        <w:numPr>
-          <w:ilvl w:val="1"/>
-          <w:numId w:val="1014"/>
-        </w:numPr>
-        <w:pStyle w:val="Compact"/>
-      </w:pPr>
-      <w:r>
-        <w:t xml:space="preserve">When DPO’s answer is much longer it loses 64–101; when it’s shorter it wins 19–6. So the judge penalizes length rather than rewarding it (unlike the length bias often reported for LLM judges [6, 12]).</w:t>
-      </w:r>
-    </w:p>
-    <w:p>
-      <w:pPr>
-        <w:numPr>
-          <w:ilvl w:val="1"/>
-          <w:numId w:val="1014"/>
-        </w:numPr>
-        <w:pStyle w:val="Compact"/>
-      </w:pPr>
-      <w:r>
-        <w:t xml:space="preserve">By AlpacaEval subset: oasst 0.57, vicuna 0.53, selfinstruct 0.44, koala 0.40, helpful_base 0.35 (n = 40–95 each, so only indicative).</w:t>
-      </w:r>
-    </w:p>
-    <w:p>
-      <w:pPr>
-        <w:numPr>
-          <w:ilvl w:val="0"/>
-          <w:numId w:val="1013"/>
-        </w:numPr>
-        <w:pStyle w:val="Compact"/>
-      </w:pPr>
-      <w:r>
         <w:rPr>
           <w:iCs/>
           <w:i/>
         </w:rPr>
-        <w:t xml:space="preserve">Interpretation:</w:t>
+        <w:t xml:space="preserve">Observed:</w:t>
       </w:r>
     </w:p>
     <w:p>
@@ -6313,35 +6345,7 @@
         <w:pStyle w:val="Compact"/>
       </w:pPr>
       <w:r>
-        <w:rPr>
-          <w:bCs/>
-          <w:b/>
-        </w:rPr>
-        <w:t xml:space="preserve">Preference-data mismatch.</w:t>
-      </w:r>
-      <w:r>
-        <w:t xml:space="preserve"> </w:t>
-      </w:r>
-      <w:r>
-        <w:t xml:space="preserve">UltraFeedback’s chosen answers are longer than its rejected ones (199 vs 172 words; longer in 55% of pairs) and were written by much larger models. DPO picks up</w:t>
-      </w:r>
-      <w:r>
-        <w:t xml:space="preserve"> </w:t>
-      </w:r>
-      <w:r>
-        <w:t xml:space="preserve">“</w:t>
-      </w:r>
-      <w:r>
-        <w:t xml:space="preserve">more and longer</w:t>
-      </w:r>
-      <w:r>
-        <w:t xml:space="preserve">”</w:t>
-      </w:r>
-      <w:r>
-        <w:t xml:space="preserve"> </w:t>
-      </w:r>
-      <w:r>
-        <w:t xml:space="preserve">[12] without the capacity to fill it, and long list answers drift into loops.</w:t>
+        <w:t xml:space="preserve">DPO answers are 37% longer (215 → 294 tokens) and hit the 512-token limit more often (15% → 20%).</w:t>
       </w:r>
     </w:p>
     <w:p>
@@ -6353,17 +6357,7 @@
         <w:pStyle w:val="Compact"/>
       </w:pPr>
       <w:r>
-        <w:rPr>
-          <w:bCs/>
-          <w:b/>
-        </w:rPr>
-        <w:t xml:space="preserve">Truncation.</w:t>
-      </w:r>
-      <w:r>
-        <w:t xml:space="preserve"> </w:t>
-      </w:r>
-      <w:r>
-        <w:t xml:space="preserve">41% of UltraFeedback pairs were truncated at 512 tokens, so in those pairs neither response teaches the model where to stop.</w:t>
+        <w:t xml:space="preserve">When DPO hits the limit, it wins 10 and loses 26. In 21 of those 26 losses, the judge’s reason names a repetition loop (E4).</w:t>
       </w:r>
     </w:p>
     <w:p>
@@ -6375,17 +6369,7 @@
         <w:pStyle w:val="Compact"/>
       </w:pPr>
       <w:r>
-        <w:rPr>
-          <w:bCs/>
-          <w:b/>
-        </w:rPr>
-        <w:t xml:space="preserve">Likelihood displacement</w:t>
-      </w:r>
-      <w:r>
-        <w:t xml:space="preserve"> </w:t>
-      </w:r>
-      <w:r>
-        <w:t xml:space="preserve">(Fig. 2d) lowers the probability of rejected continuations broadly. We hypothesize this also weakens stopping, but we did not test it directly.</w:t>
+        <w:t xml:space="preserve">When it doesn’t hit the limit, the comparison is even (93–97).</w:t>
       </w:r>
     </w:p>
     <w:p>
@@ -6397,17 +6381,7 @@
         <w:pStyle w:val="Compact"/>
       </w:pPr>
       <w:r>
-        <w:rPr>
-          <w:bCs/>
-          <w:b/>
-        </w:rPr>
-        <w:t xml:space="preserve">Little headroom over SFT otherwise.</w:t>
-      </w:r>
-      <w:r>
-        <w:t xml:space="preserve"> </w:t>
-      </w:r>
-      <w:r>
-        <w:t xml:space="preserve">Where DPO stays under the limit, the comparison is even (93–97): it fixes some SFT errors (E5) and introduces others, for no net gain.</w:t>
+        <w:t xml:space="preserve">When DPO’s answer is much longer it loses 64–101; when it’s shorter it wins 19–6. So the judge penalizes length rather than rewarding it (unlike the length bias often reported for LLM judges [6, 12]).</w:t>
       </w:r>
     </w:p>
     <w:p>
@@ -6419,108 +6393,242 @@
         <w:pStyle w:val="Compact"/>
       </w:pPr>
       <w:r>
-        <w:t xml:space="preserve">Overall, a validation reward accuracy of 0.73 means DPO</w:t>
-      </w:r>
-      <w:r>
-        <w:t xml:space="preserve"> </w:t>
-      </w:r>
+        <w:t xml:space="preserve">By AlpacaEval subset: oasst 0.57, vicuna 0.53, selfinstruct 0.44, koala 0.40, helpful_base 0.35 (n = 40–95 each, so only indicative).</w:t>
+      </w:r>
+    </w:p>
+    <w:p>
+      <w:pPr>
+        <w:numPr>
+          <w:ilvl w:val="0"/>
+          <w:numId w:val="1014"/>
+        </w:numPr>
+        <w:pStyle w:val="Compact"/>
+      </w:pPr>
       <w:r>
         <w:rPr>
           <w:iCs/>
           <w:i/>
         </w:rPr>
-        <w:t xml:space="preserve">ranks</w:t>
-      </w:r>
-      <w:r>
-        <w:t xml:space="preserve"> </w:t>
-      </w:r>
-      <w:r>
-        <w:t xml:space="preserve">held-out pairs well, not that it</w:t>
-      </w:r>
-      <w:r>
-        <w:t xml:space="preserve"> </w:t>
-      </w:r>
-      <w:r>
-        <w:rPr>
-          <w:iCs/>
-          <w:i/>
-        </w:rPr>
-        <w:t xml:space="preserve">generates</w:t>
-      </w:r>
-      <w:r>
-        <w:t xml:space="preserve"> </w:t>
-      </w:r>
-      <w:r>
-        <w:t xml:space="preserve">better.</w:t>
-      </w:r>
-    </w:p>
-    <w:p>
-      <w:pPr>
-        <w:pStyle w:val="FirstParagraph"/>
-      </w:pPr>
-      <w:r>
-        <w:rPr>
-          <w:bCs/>
-          <w:b/>
-        </w:rPr>
-        <w:t xml:space="preserve">Persona LoRA-DPO is more stylistically faithful but less useful.</w:t>
+        <w:t xml:space="preserve">Interpretation:</w:t>
       </w:r>
     </w:p>
     <w:p>
       <w:pPr>
         <w:numPr>
-          <w:ilvl w:val="0"/>
+          <w:ilvl w:val="1"/>
           <w:numId w:val="1016"/>
         </w:numPr>
         <w:pStyle w:val="Compact"/>
       </w:pPr>
       <w:r>
         <w:rPr>
-          <w:iCs/>
-          <w:i/>
-        </w:rPr>
-        <w:t xml:space="preserve">Observed:</w:t>
-      </w:r>
-      <w:r>
-        <w:t xml:space="preserve"> </w:t>
-      </w:r>
-      <w:r>
-        <w:t xml:space="preserve">style wins 18–1, but quality loses 14–22 (E6). The adapter adds insults and theatrics and sometimes worse advice. It is not less safe by the judge (safety-sensitive prompts 5–4).</w:t>
+          <w:bCs/>
+          <w:b/>
+        </w:rPr>
+        <w:t xml:space="preserve">Preference-data mismatch.</w:t>
+      </w:r>
+      <w:r>
+        <w:t xml:space="preserve"> </w:t>
+      </w:r>
+      <w:r>
+        <w:t xml:space="preserve">UltraFeedback’s chosen answers are longer than its rejected ones (199 vs 172 words; longer in 55% of pairs) and were written by much larger models. DPO picks up</w:t>
+      </w:r>
+      <w:r>
+        <w:t xml:space="preserve"> </w:t>
+      </w:r>
+      <w:r>
+        <w:t xml:space="preserve">“</w:t>
+      </w:r>
+      <w:r>
+        <w:t xml:space="preserve">more and longer</w:t>
+      </w:r>
+      <w:r>
+        <w:t xml:space="preserve">”</w:t>
+      </w:r>
+      <w:r>
+        <w:t xml:space="preserve"> </w:t>
+      </w:r>
+      <w:r>
+        <w:t xml:space="preserve">[12] without the capacity to fill it, and long list answers drift into loops.</w:t>
       </w:r>
     </w:p>
     <w:p>
       <w:pPr>
         <w:numPr>
-          <w:ilvl w:val="0"/>
+          <w:ilvl w:val="1"/>
           <w:numId w:val="1016"/>
         </w:numPr>
         <w:pStyle w:val="Compact"/>
       </w:pPr>
       <w:r>
         <w:rPr>
+          <w:bCs/>
+          <w:b/>
+        </w:rPr>
+        <w:t xml:space="preserve">Truncation.</w:t>
+      </w:r>
+      <w:r>
+        <w:t xml:space="preserve"> </w:t>
+      </w:r>
+      <w:r>
+        <w:t xml:space="preserve">41% of UltraFeedback pairs were truncated at 512 tokens, so in those pairs neither response teaches the model where to stop.</w:t>
+      </w:r>
+    </w:p>
+    <w:p>
+      <w:pPr>
+        <w:numPr>
+          <w:ilvl w:val="1"/>
+          <w:numId w:val="1016"/>
+        </w:numPr>
+        <w:pStyle w:val="Compact"/>
+      </w:pPr>
+      <w:r>
+        <w:rPr>
+          <w:bCs/>
+          <w:b/>
+        </w:rPr>
+        <w:t xml:space="preserve">Likelihood displacement</w:t>
+      </w:r>
+      <w:r>
+        <w:t xml:space="preserve"> </w:t>
+      </w:r>
+      <w:r>
+        <w:t xml:space="preserve">(Fig. 2d) lowers the probability of rejected continuations broadly. We hypothesize this also weakens stopping, but we did not test it directly.</w:t>
+      </w:r>
+    </w:p>
+    <w:p>
+      <w:pPr>
+        <w:numPr>
+          <w:ilvl w:val="1"/>
+          <w:numId w:val="1016"/>
+        </w:numPr>
+        <w:pStyle w:val="Compact"/>
+      </w:pPr>
+      <w:r>
+        <w:rPr>
+          <w:bCs/>
+          <w:b/>
+        </w:rPr>
+        <w:t xml:space="preserve">Little headroom over SFT otherwise.</w:t>
+      </w:r>
+      <w:r>
+        <w:t xml:space="preserve"> </w:t>
+      </w:r>
+      <w:r>
+        <w:t xml:space="preserve">Where DPO stays under the limit, the comparison is even (93–97): it fixes some SFT errors (E5) and introduces others, for no net gain.</w:t>
+      </w:r>
+    </w:p>
+    <w:p>
+      <w:pPr>
+        <w:numPr>
+          <w:ilvl w:val="1"/>
+          <w:numId w:val="1016"/>
+        </w:numPr>
+        <w:pStyle w:val="Compact"/>
+      </w:pPr>
+      <w:r>
+        <w:t xml:space="preserve">Overall, a validation reward accuracy of 0.73 means DPO</w:t>
+      </w:r>
+      <w:r>
+        <w:t xml:space="preserve"> </w:t>
+      </w:r>
+      <w:r>
+        <w:rPr>
           <w:iCs/>
           <w:i/>
         </w:rPr>
-        <w:t xml:space="preserve">Interpretation:</w:t>
+        <w:t xml:space="preserve">ranks</w:t>
+      </w:r>
+      <w:r>
+        <w:t xml:space="preserve"> </w:t>
+      </w:r>
+      <w:r>
+        <w:t xml:space="preserve">held-out pairs well, not that it</w:t>
+      </w:r>
+      <w:r>
+        <w:t xml:space="preserve"> </w:t>
+      </w:r>
+      <w:r>
+        <w:rPr>
+          <w:iCs/>
+          <w:i/>
+        </w:rPr>
+        <w:t xml:space="preserve">generates</w:t>
+      </w:r>
+      <w:r>
+        <w:t xml:space="preserve"> </w:t>
+      </w:r>
+      <w:r>
+        <w:t xml:space="preserve">better.</w:t>
+      </w:r>
+    </w:p>
+    <w:p>
+      <w:pPr>
+        <w:pStyle w:val="FirstParagraph"/>
+      </w:pPr>
+      <w:r>
+        <w:rPr>
+          <w:bCs/>
+          <w:b/>
+        </w:rPr>
+        <w:t xml:space="preserve">Persona LoRA-DPO is more stylistically faithful but less useful.</w:t>
       </w:r>
     </w:p>
     <w:p>
       <w:pPr>
         <w:numPr>
-          <w:ilvl w:val="1"/>
+          <w:ilvl w:val="0"/>
           <w:numId w:val="1017"/>
         </w:numPr>
         <w:pStyle w:val="Compact"/>
       </w:pPr>
       <w:r>
-        <w:t xml:space="preserve">It isn’t safer either: like the base model, it answers the chloroform prompt. The persona data teaches tone, not refusal.</w:t>
+        <w:rPr>
+          <w:iCs/>
+          <w:i/>
+        </w:rPr>
+        <w:t xml:space="preserve">Observed:</w:t>
+      </w:r>
+      <w:r>
+        <w:t xml:space="preserve"> </w:t>
+      </w:r>
+      <w:r>
+        <w:t xml:space="preserve">style wins 18–1, but quality loses 14–22 (E6). The adapter adds insults and theatrics and sometimes worse advice. It is not less safe by the judge (safety-sensitive prompts 5–4).</w:t>
+      </w:r>
+    </w:p>
+    <w:p>
+      <w:pPr>
+        <w:numPr>
+          <w:ilvl w:val="0"/>
+          <w:numId w:val="1017"/>
+        </w:numPr>
+        <w:pStyle w:val="Compact"/>
+      </w:pPr>
+      <w:r>
+        <w:rPr>
+          <w:iCs/>
+          <w:i/>
+        </w:rPr>
+        <w:t xml:space="preserve">Interpretation:</w:t>
       </w:r>
     </w:p>
     <w:p>
       <w:pPr>
         <w:numPr>
           <w:ilvl w:val="1"/>
-          <w:numId w:val="1017"/>
+          <w:numId w:val="1018"/>
+        </w:numPr>
+        <w:pStyle w:val="Compact"/>
+      </w:pPr>
+      <w:r>
+        <w:t xml:space="preserve">It isn’t safer either: like the base model, it answers the chloroform prompt. The persona data teaches tone, not refusal.</w:t>
+      </w:r>
+    </w:p>
+    <w:p>
+      <w:pPr>
+        <w:numPr>
+          <w:ilvl w:val="1"/>
+          <w:numId w:val="1018"/>
         </w:numPr>
         <w:pStyle w:val="Compact"/>
       </w:pPr>
@@ -7311,53 +7419,75 @@
       <w:pPr>
         <w:numPr>
           <w:ilvl w:val="0"/>
-          <w:numId w:val="1018"/>
-        </w:numPr>
-        <w:pStyle w:val="Compact"/>
-      </w:pPr>
-      <w:r>
-        <w:rPr>
-          <w:bCs/>
-          <w:b/>
-        </w:rPr>
-        <w:t xml:space="preserve">Judge.</w:t>
-      </w:r>
-      <w:r>
-        <w:t xml:space="preserve"> </w:t>
-      </w:r>
-      <w:r>
-        <w:t xml:space="preserve">We used a single judge model, with a mild preference for the response shown first: A chosen 127 vs B 99 on AlpacaEval, 152 vs 113 on HH. Randomizing the order spreads this bias evenly across both models. The judge is also not perfectly repeatable:</w:t>
-      </w:r>
-    </w:p>
-    <w:p>
-      <w:pPr>
-        <w:numPr>
-          <w:ilvl w:val="1"/>
           <w:numId w:val="1019"/>
         </w:numPr>
         <w:pStyle w:val="Compact"/>
       </w:pPr>
       <w:r>
-        <w:t xml:space="preserve">the 40 identical persona pairs, judged in two separate Kaggle runs, received the same verdict 95% of the time;</w:t>
+        <w:rPr>
+          <w:bCs/>
+          <w:b/>
+        </w:rPr>
+        <w:t xml:space="preserve">Judge.</w:t>
+      </w:r>
+      <w:r>
+        <w:t xml:space="preserve"> </w:t>
+      </w:r>
+      <w:r>
+        <w:t xml:space="preserve">We used a single judge model, with a mild preference for the response shown first: A chosen 127 vs B 99 on AlpacaEval, 152 vs 113 on HH. Randomizing the order spreads this bias evenly across both models. The judge is also not perfectly repeatable:</w:t>
       </w:r>
     </w:p>
     <w:p>
       <w:pPr>
         <w:numPr>
           <w:ilvl w:val="1"/>
+          <w:numId w:val="1020"/>
+        </w:numPr>
+        <w:pStyle w:val="Compact"/>
+      </w:pPr>
+      <w:r>
+        <w:t xml:space="preserve">the 40 identical persona pairs, judged in two separate Kaggle runs, received the same verdict 95% of the time;</w:t>
+      </w:r>
+    </w:p>
+    <w:p>
+      <w:pPr>
+        <w:numPr>
+          <w:ilvl w:val="1"/>
+          <w:numId w:val="1020"/>
+        </w:numPr>
+        <w:pStyle w:val="Compact"/>
+      </w:pPr>
+      <w:r>
+        <w:t xml:space="preserve">repeated identical HH pairs agreed 86% of the time in the same A/B order and 82% when the order was swapped.</w:t>
+      </w:r>
+    </w:p>
+    <w:p>
+      <w:pPr>
+        <w:numPr>
+          <w:ilvl w:val="0"/>
           <w:numId w:val="1019"/>
         </w:numPr>
         <w:pStyle w:val="Compact"/>
       </w:pPr>
       <w:r>
-        <w:t xml:space="preserve">repeated identical HH pairs agreed 86% of the time in the same A/B order and 82% when the order was swapped.</w:t>
+        <w:rPr>
+          <w:bCs/>
+          <w:b/>
+        </w:rPr>
+        <w:t xml:space="preserve">Small evaluation sets.</w:t>
+      </w:r>
+      <w:r>
+        <w:t xml:space="preserve"> </w:t>
+      </w:r>
+      <w:r>
+        <w:t xml:space="preserve">Confidence intervals are about ±6–7 points with 300 prompts, so we can’t resolve UltraFeedback’s small effect. The HH set has only 185 distinct prompts. The persona set has 40 prompts, and adapter selection used only 20 validation pairs.</w:t>
       </w:r>
     </w:p>
     <w:p>
       <w:pPr>
         <w:numPr>
           <w:ilvl w:val="0"/>
-          <w:numId w:val="1018"/>
+          <w:numId w:val="1019"/>
         </w:numPr>
         <w:pStyle w:val="Compact"/>
       </w:pPr>
@@ -7366,20 +7496,20 @@
           <w:bCs/>
           <w:b/>
         </w:rPr>
-        <w:t xml:space="preserve">Small evaluation sets.</w:t>
-      </w:r>
-      <w:r>
-        <w:t xml:space="preserve"> </w:t>
-      </w:r>
-      <w:r>
-        <w:t xml:space="preserve">Confidence intervals are about ±6–7 points with 300 prompts, so we can’t resolve UltraFeedback’s small effect. The HH set has only 185 distinct prompts. The persona set has 40 prompts, and adapter selection used only 20 validation pairs.</w:t>
+        <w:t xml:space="preserve">One seed and no sweep for the from-scratch runs.</w:t>
+      </w:r>
+      <w:r>
+        <w:t xml:space="preserve"> </w:t>
+      </w:r>
+      <w:r>
+        <w:t xml:space="preserve">Each run used a single seed, and we didn’t sweep β or the learning rate for the from-scratch DPO runs.</w:t>
       </w:r>
     </w:p>
     <w:p>
       <w:pPr>
         <w:numPr>
           <w:ilvl w:val="0"/>
-          <w:numId w:val="1018"/>
+          <w:numId w:val="1019"/>
         </w:numPr>
         <w:pStyle w:val="Compact"/>
       </w:pPr>
@@ -7388,42 +7518,20 @@
           <w:bCs/>
           <w:b/>
         </w:rPr>
-        <w:t xml:space="preserve">One seed and no sweep for the from-scratch runs.</w:t>
-      </w:r>
-      <w:r>
-        <w:t xml:space="preserve"> </w:t>
-      </w:r>
-      <w:r>
-        <w:t xml:space="preserve">Each run used a single seed, and we didn’t sweep β or the learning rate for the from-scratch DPO runs.</w:t>
+        <w:t xml:space="preserve">Truncation and judge hints.</w:t>
+      </w:r>
+      <w:r>
+        <w:t xml:space="preserve"> </w:t>
+      </w:r>
+      <w:r>
+        <w:t xml:space="preserve">The 512-token limit truncates 41–44% of SFT and UltraFeedback training examples. The HH judge saw the eval set’s expected-behavior notes, which may make it stricter on safety.</w:t>
       </w:r>
     </w:p>
     <w:p>
       <w:pPr>
         <w:numPr>
           <w:ilvl w:val="0"/>
-          <w:numId w:val="1018"/>
-        </w:numPr>
-        <w:pStyle w:val="Compact"/>
-      </w:pPr>
-      <w:r>
-        <w:rPr>
-          <w:bCs/>
-          <w:b/>
-        </w:rPr>
-        <w:t xml:space="preserve">Truncation and judge hints.</w:t>
-      </w:r>
-      <w:r>
-        <w:t xml:space="preserve"> </w:t>
-      </w:r>
-      <w:r>
-        <w:t xml:space="preserve">The 512-token limit truncates 41–44% of SFT and UltraFeedback training examples. The HH judge saw the eval set’s expected-behavior notes, which may make it stricter on safety.</w:t>
-      </w:r>
-    </w:p>
-    <w:p>
-      <w:pPr>
-        <w:numPr>
-          <w:ilvl w:val="0"/>
-          <w:numId w:val="1018"/>
+          <w:numId w:val="1019"/>
         </w:numPr>
         <w:pStyle w:val="Compact"/>
       </w:pPr>
@@ -8360,6 +8468,9 @@
     <w:abstractNumId w:val="991"/>
   </w:num>
   <w:num w:numId="1003">
+    <w:abstractNumId w:val="991"/>
+  </w:num>
+  <w:num w:numId="1004">
     <w:abstractNumId w:val="99411"/>
     <w:lvlOverride w:ilvl="0">
       <w:startOverride w:val="1"/>
@@ -8388,9 +8499,6 @@
     <w:lvlOverride w:ilvl="8">
       <w:startOverride w:val="1"/>
     </w:lvlOverride>
-  </w:num>
-  <w:num w:numId="1004">
-    <w:abstractNumId w:val="991"/>
   </w:num>
   <w:num w:numId="1005">
     <w:abstractNumId w:val="991"/>
@@ -8435,6 +8543,9 @@
     <w:abstractNumId w:val="991"/>
   </w:num>
   <w:num w:numId="1019">
+    <w:abstractNumId w:val="991"/>
+  </w:num>
+  <w:num w:numId="1020">
     <w:abstractNumId w:val="991"/>
   </w:num>
 </w:numbering>

</xml_diff>